<commit_message>
chore: update CV files with new visual style
</commit_message>
<xml_diff>
--- a/assets/cv/Felipe_Romani_CV_EN.docx
+++ b/assets/cv/Felipe_Romani_CV_EN.docx
@@ -4,703 +4,926 @@
   <w:body>
     <w:p>
       <w:pPr>
-        <w:jc w:val="center"/>
+        <w:spacing w:after="80"/>
+        <w:jc w:val="left"/>
       </w:pPr>
       <w:r>
         <w:rPr>
           <w:b/>
-          <w:sz w:val="36"/>
+          <w:sz w:val="56"/>
         </w:rPr>
-        <w:t>FELIPE ROMANI</w:t>
+        <w:t>Felipe Romani</w:t>
       </w:r>
     </w:p>
     <w:p>
       <w:pPr>
-        <w:jc w:val="center"/>
+        <w:spacing w:before="40" w:after="80"/>
+        <w:pBdr>
+          <w:bottom w:val="single" w:sz="6" w:space="1" w:color="333333"/>
+        </w:pBdr>
+      </w:pPr>
+    </w:p>
+    <w:tbl>
+      <w:tblPr>
+        <w:tblStyle w:val="TableGrid"/>
+        <w:tblW w:type="auto" w:w="0"/>
+        <w:tblLook w:firstColumn="1" w:firstRow="1" w:lastColumn="0" w:lastRow="0" w:noHBand="0" w:noVBand="1" w:val="04A0"/>
+      </w:tblPr>
+      <w:tblGrid>
+        <w:gridCol w:w="4752"/>
+        <w:gridCol w:w="4752"/>
+      </w:tblGrid>
+      <w:tr>
+        <w:tc>
+          <w:tcPr>
+            <w:tcW w:type="dxa" w:w="4968"/>
+            <w:tcBorders>
+              <w:left w:val="none"/>
+              <w:top w:val="none"/>
+              <w:right w:val="none"/>
+              <w:bottom w:val="none"/>
+              <w:insideH w:val="none"/>
+              <w:insideV w:val="none"/>
+            </w:tcBorders>
+          </w:tcPr>
+          <w:p/>
+          <w:p>
+            <w:pPr>
+              <w:spacing w:after="20"/>
+            </w:pPr>
+            <w:r>
+              <w:rPr>
+                <w:sz w:val="19"/>
+              </w:rPr>
+              <w:t>+55 12 98247-3960</w:t>
+            </w:r>
+          </w:p>
+          <w:p>
+            <w:pPr>
+              <w:spacing w:after="20"/>
+            </w:pPr>
+            <w:r>
+              <w:rPr>
+                <w:sz w:val="19"/>
+              </w:rPr>
+              <w:t>fcromani00@gmail.com</w:t>
+            </w:r>
+          </w:p>
+          <w:p>
+            <w:pPr>
+              <w:spacing w:after="20"/>
+            </w:pPr>
+            <w:r>
+              <w:rPr>
+                <w:sz w:val="19"/>
+              </w:rPr>
+              <w:t>Sao Paulo - SP - Brazil | GMT-3</w:t>
+            </w:r>
+          </w:p>
+        </w:tc>
+        <w:tc>
+          <w:tcPr>
+            <w:tcW w:type="dxa" w:w="4968"/>
+            <w:tcBorders>
+              <w:left w:val="none"/>
+              <w:top w:val="none"/>
+              <w:right w:val="none"/>
+              <w:bottom w:val="none"/>
+              <w:insideH w:val="none"/>
+              <w:insideV w:val="none"/>
+            </w:tcBorders>
+          </w:tcPr>
+          <w:p/>
+          <w:p>
+            <w:pPr>
+              <w:spacing w:after="20"/>
+            </w:pPr>
+            <w:r>
+              <w:rPr>
+                <w:sz w:val="19"/>
+              </w:rPr>
+              <w:t>feliperomani.vercel.app</w:t>
+            </w:r>
+          </w:p>
+          <w:p>
+            <w:pPr>
+              <w:spacing w:after="20"/>
+            </w:pPr>
+            <w:r>
+              <w:rPr>
+                <w:sz w:val="19"/>
+              </w:rPr>
+              <w:t>linkedin.com/in/feliperomani</w:t>
+            </w:r>
+          </w:p>
+          <w:p>
+            <w:pPr>
+              <w:spacing w:after="20"/>
+            </w:pPr>
+            <w:r>
+              <w:rPr>
+                <w:sz w:val="19"/>
+              </w:rPr>
+              <w:t>github.com/fcromani00</w:t>
+            </w:r>
+          </w:p>
+        </w:tc>
+      </w:tr>
+    </w:tbl>
+    <w:p>
+      <w:pPr>
+        <w:spacing w:before="40" w:after="80"/>
+        <w:pBdr>
+          <w:bottom w:val="single" w:sz="6" w:space="1" w:color="333333"/>
+        </w:pBdr>
+      </w:pPr>
+    </w:p>
+    <w:p>
+      <w:pPr>
+        <w:spacing w:after="40"/>
+      </w:pPr>
+    </w:p>
+    <w:p>
+      <w:pPr>
+        <w:spacing w:before="40" w:after="80"/>
+        <w:pBdr>
+          <w:bottom w:val="single" w:sz="6" w:space="1" w:color="222222"/>
+        </w:pBdr>
+      </w:pPr>
+    </w:p>
+    <w:p>
+      <w:pPr>
+        <w:spacing w:before="160" w:after="80"/>
       </w:pPr>
       <w:r>
         <w:rPr>
-          <w:color w:val="444444"/>
-          <w:sz w:val="22"/>
+          <w:b/>
+          <w:color w:val="111111"/>
+          <w:sz w:val="20"/>
         </w:rPr>
-        <w:t>Data Analyst | Data Engineer | AI Developer</w:t>
+        <w:t>SUMMARY</w:t>
       </w:r>
     </w:p>
     <w:p>
       <w:pPr>
-        <w:spacing w:after="20"/>
+        <w:spacing w:before="40" w:after="80"/>
+        <w:pBdr>
+          <w:bottom w:val="single" w:sz="6" w:space="1" w:color="444444"/>
+        </w:pBdr>
+      </w:pPr>
+    </w:p>
+    <w:p>
+      <w:pPr>
+        <w:spacing w:after="80"/>
       </w:pPr>
       <w:r>
-        <w:t>São Paulo, SP, Brazil | GMT-3</w:t>
+        <w:rPr>
+          <w:sz w:val="19"/>
+        </w:rPr>
+        <w:t>Data Analyst and AI Developer with 4+ years of experience delivering data products across investment banking, semiconductors, brokerage, and fintech. Ranked top 0.41% of GenAI users among 10,000+ MercadoLibre employees. Expertise in Python, SQL, BigQuery, GCP, n8n, and LLMs, with a proven track record of building production data pipelines, automating complex financial processes, and leading AI adoption that increased team coding productivity by ~50%. Fluent in English (C2) with experience on global teams.</w:t>
       </w:r>
     </w:p>
     <w:p>
       <w:pPr>
-        <w:spacing w:after="20"/>
+        <w:spacing w:before="40" w:after="80"/>
+        <w:pBdr>
+          <w:bottom w:val="single" w:sz="6" w:space="1" w:color="222222"/>
+        </w:pBdr>
+      </w:pPr>
+    </w:p>
+    <w:p>
+      <w:pPr>
+        <w:spacing w:before="160" w:after="80"/>
       </w:pPr>
       <w:r>
-        <w:t>fcromani00@gmail.com | +55 12 98247-3960</w:t>
+        <w:rPr>
+          <w:b/>
+          <w:color w:val="111111"/>
+          <w:sz w:val="20"/>
+        </w:rPr>
+        <w:t>SKILLS</w:t>
       </w:r>
     </w:p>
     <w:p>
       <w:pPr>
-        <w:spacing w:after="20"/>
+        <w:spacing w:before="40" w:after="80"/>
+        <w:pBdr>
+          <w:bottom w:val="single" w:sz="6" w:space="1" w:color="444444"/>
+        </w:pBdr>
       </w:pPr>
-      <w:r>
-        <w:t>linkedin.com/in/feliperomani | github.com/fcromani00 | feliperomani.vercel.app</w:t>
-      </w:r>
+    </w:p>
+    <w:tbl>
+      <w:tblPr>
+        <w:tblStyle w:val="TableGrid"/>
+        <w:tblW w:type="auto" w:w="0"/>
+        <w:tblLook w:firstColumn="1" w:firstRow="1" w:lastColumn="0" w:lastRow="0" w:noHBand="0" w:noVBand="1" w:val="04A0"/>
+      </w:tblPr>
+      <w:tblGrid>
+        <w:gridCol w:w="3168"/>
+        <w:gridCol w:w="3168"/>
+        <w:gridCol w:w="3168"/>
+      </w:tblGrid>
+      <w:tr>
+        <w:tc>
+          <w:tcPr>
+            <w:tcW w:type="dxa" w:w="3312"/>
+            <w:tcBorders>
+              <w:left w:val="none"/>
+              <w:top w:val="none"/>
+              <w:right w:val="none"/>
+              <w:bottom w:val="none"/>
+              <w:insideH w:val="none"/>
+              <w:insideV w:val="none"/>
+            </w:tcBorders>
+          </w:tcPr>
+          <w:p/>
+          <w:p>
+            <w:pPr>
+              <w:spacing w:after="20"/>
+            </w:pPr>
+            <w:r>
+              <w:rPr>
+                <w:sz w:val="19"/>
+              </w:rPr>
+              <w:t>Python</w:t>
+            </w:r>
+          </w:p>
+          <w:p>
+            <w:pPr>
+              <w:spacing w:after="20"/>
+            </w:pPr>
+            <w:r>
+              <w:rPr>
+                <w:sz w:val="19"/>
+              </w:rPr>
+              <w:t>SQL / BigQuery</w:t>
+            </w:r>
+          </w:p>
+          <w:p>
+            <w:pPr>
+              <w:spacing w:after="20"/>
+            </w:pPr>
+            <w:r>
+              <w:rPr>
+                <w:sz w:val="19"/>
+              </w:rPr>
+              <w:t>Power BI / Looker Studio</w:t>
+            </w:r>
+          </w:p>
+          <w:p>
+            <w:pPr>
+              <w:spacing w:after="20"/>
+            </w:pPr>
+            <w:r>
+              <w:rPr>
+                <w:sz w:val="19"/>
+              </w:rPr>
+              <w:t>Git / Docker / Vercel</w:t>
+            </w:r>
+          </w:p>
+        </w:tc>
+        <w:tc>
+          <w:tcPr>
+            <w:tcW w:type="dxa" w:w="3312"/>
+            <w:tcBorders>
+              <w:left w:val="none"/>
+              <w:top w:val="none"/>
+              <w:right w:val="none"/>
+              <w:bottom w:val="none"/>
+              <w:insideH w:val="none"/>
+              <w:insideV w:val="none"/>
+            </w:tcBorders>
+          </w:tcPr>
+          <w:p/>
+          <w:p>
+            <w:pPr>
+              <w:spacing w:after="20"/>
+            </w:pPr>
+            <w:r>
+              <w:rPr>
+                <w:sz w:val="19"/>
+              </w:rPr>
+              <w:t>GCP / Dataflow / Cloud Storage</w:t>
+            </w:r>
+          </w:p>
+          <w:p>
+            <w:pPr>
+              <w:spacing w:after="20"/>
+            </w:pPr>
+            <w:r>
+              <w:rPr>
+                <w:sz w:val="19"/>
+              </w:rPr>
+              <w:t>n8n (Verdi Flows)</w:t>
+            </w:r>
+          </w:p>
+          <w:p>
+            <w:pPr>
+              <w:spacing w:after="20"/>
+            </w:pPr>
+            <w:r>
+              <w:rPr>
+                <w:sz w:val="19"/>
+              </w:rPr>
+              <w:t>Databricks / Snowflake</w:t>
+            </w:r>
+          </w:p>
+          <w:p>
+            <w:pPr>
+              <w:spacing w:after="20"/>
+            </w:pPr>
+            <w:r>
+              <w:rPr>
+                <w:sz w:val="19"/>
+              </w:rPr>
+              <w:t>FastAPI / Flask / Streamlit</w:t>
+            </w:r>
+          </w:p>
+        </w:tc>
+        <w:tc>
+          <w:tcPr>
+            <w:tcW w:type="dxa" w:w="3312"/>
+            <w:tcBorders>
+              <w:left w:val="none"/>
+              <w:top w:val="none"/>
+              <w:right w:val="none"/>
+              <w:bottom w:val="none"/>
+              <w:insideH w:val="none"/>
+              <w:insideV w:val="none"/>
+            </w:tcBorders>
+          </w:tcPr>
+          <w:p/>
+          <w:p>
+            <w:pPr>
+              <w:spacing w:after="20"/>
+            </w:pPr>
+            <w:r>
+              <w:rPr>
+                <w:sz w:val="19"/>
+              </w:rPr>
+              <w:t>Claude AI / Gemini / LLMs</w:t>
+            </w:r>
+          </w:p>
+          <w:p>
+            <w:pPr>
+              <w:spacing w:after="20"/>
+            </w:pPr>
+            <w:r>
+              <w:rPr>
+                <w:sz w:val="19"/>
+              </w:rPr>
+              <w:t>AI Agents / RAG / MCP</w:t>
+            </w:r>
+          </w:p>
+          <w:p>
+            <w:pPr>
+              <w:spacing w:after="20"/>
+            </w:pPr>
+            <w:r>
+              <w:rPr>
+                <w:sz w:val="19"/>
+              </w:rPr>
+              <w:t>Pandas / NumPy / Plotly</w:t>
+            </w:r>
+          </w:p>
+          <w:p>
+            <w:pPr>
+              <w:spacing w:after="20"/>
+            </w:pPr>
+            <w:r>
+              <w:rPr>
+                <w:sz w:val="19"/>
+              </w:rPr>
+              <w:t>Azure DevOps / ADF</w:t>
+            </w:r>
+          </w:p>
+        </w:tc>
+      </w:tr>
+    </w:tbl>
+    <w:p>
+      <w:pPr>
+        <w:spacing w:before="40" w:after="80"/>
+        <w:pBdr>
+          <w:bottom w:val="single" w:sz="6" w:space="1" w:color="222222"/>
+        </w:pBdr>
+      </w:pPr>
     </w:p>
     <w:p>
       <w:pPr>
-        <w:spacing w:before="40" w:after="40"/>
-      </w:pPr>
-      <w:r>
-        <w:rPr>
-          <w:color w:val="BBBBBB"/>
-          <w:sz w:val="16"/>
-        </w:rPr>
-        <w:t>────────────────────────────────────────────────────────────────────────────────</w:t>
-      </w:r>
-    </w:p>
-    <w:p>
-      <w:pPr>
-        <w:spacing w:before="120" w:after="40"/>
+        <w:spacing w:before="160" w:after="80"/>
       </w:pPr>
       <w:r>
         <w:rPr>
           <w:b/>
-          <w:color w:val="1A56AA"/>
-          <w:sz w:val="22"/>
-        </w:rPr>
-        <w:t>PROFESSIONAL SUMMARY</w:t>
-      </w:r>
-    </w:p>
-    <w:p>
-      <w:pPr>
-        <w:spacing w:after="20"/>
-      </w:pPr>
-      <w:r>
-        <w:t>Data Analyst and AI Developer with 4+ years of experience delivering data products across investment banking, semiconductors, brokerage, and fintech. Proven track record of automating complex financial processes, building production-grade data pipelines on Google Cloud, and leading Generative AI adoption in cross-functional teams. Ranked in the top 0.41% of GenAI users at MercadoLibre (10,000+ employees). Fluent in English (C2), with experience working on global teams.</w:t>
-      </w:r>
-    </w:p>
-    <w:p>
-      <w:pPr>
-        <w:spacing w:before="40" w:after="40"/>
-      </w:pPr>
-      <w:r>
-        <w:rPr>
-          <w:color w:val="BBBBBB"/>
-          <w:sz w:val="16"/>
-        </w:rPr>
-        <w:t>────────────────────────────────────────────────────────────────────────────────</w:t>
-      </w:r>
-    </w:p>
-    <w:p>
-      <w:pPr>
-        <w:spacing w:before="120" w:after="40"/>
-      </w:pPr>
-      <w:r>
-        <w:rPr>
-          <w:b/>
-          <w:color w:val="1A56AA"/>
-          <w:sz w:val="22"/>
+          <w:color w:val="111111"/>
+          <w:sz w:val="20"/>
         </w:rPr>
         <w:t>WORK EXPERIENCE</w:t>
       </w:r>
     </w:p>
     <w:p>
       <w:pPr>
+        <w:spacing w:before="40" w:after="80"/>
+        <w:pBdr>
+          <w:bottom w:val="single" w:sz="6" w:space="1" w:color="444444"/>
+        </w:pBdr>
+      </w:pPr>
+    </w:p>
+    <w:p>
+      <w:pPr>
+        <w:tabs>
+          <w:tab w:pos="8928" w:val="right"/>
+        </w:tabs>
         <w:spacing w:before="120" w:after="20"/>
       </w:pPr>
       <w:r>
         <w:rPr>
           <w:b/>
-          <w:sz w:val="21"/>
+          <w:sz w:val="20"/>
         </w:rPr>
-        <w:t>Mercado Pago · MercadoLibre Group                              Jul 2025 – Present</w:t>
+        <w:t>Mercado Pago · MercadoLibre Group</w:t>
+      </w:r>
+      <w:r>
+        <w:tab/>
+      </w:r>
+      <w:r>
+        <w:rPr>
+          <w:b/>
+          <w:color w:val="444444"/>
+          <w:sz w:val="20"/>
+        </w:rPr>
+        <w:t>Jul 2025 – Present</w:t>
       </w:r>
     </w:p>
     <w:p>
       <w:pPr>
-        <w:spacing w:after="20"/>
+        <w:spacing w:before="0" w:after="40"/>
       </w:pPr>
       <w:r>
-        <w:t>Data Analyst &amp; Automation Developer — Fintech Funding</w:t>
+        <w:rPr>
+          <w:b/>
+          <w:i w:val="0"/>
+          <w:color w:val="333333"/>
+          <w:sz w:val="20"/>
+        </w:rPr>
+        <w:t>Data Analyst &amp; Automation Developer — Fintech Funding | Osasco, SP · Hybrid</w:t>
       </w:r>
     </w:p>
     <w:p>
       <w:pPr>
-        <w:spacing w:after="20"/>
+        <w:spacing w:before="20" w:after="40"/>
       </w:pPr>
       <w:r>
-        <w:t>Osasco, São Paulo, Brazil · Hybrid</w:t>
+        <w:rPr>
+          <w:color w:val="222222"/>
+          <w:sz w:val="19"/>
+        </w:rPr>
+        <w:t>Ranked top 0.41% of GenAI users among 10,000+ MELI employees. Led training on n8n, Cursor, and LLMs (Claude, Gemini, MCP), increasing team coding productivity by ~50%. Built FIDC Daily Cash Automation using n8n (Verdi Flows) and Dataflow, unifying 4+ fund sources — saving ~1 hour of manual work daily and optimizing inputs for the ENIGMA ML model. Reduced monthly closing by 4 hours by engineering an automated classification system for financial movements and delivering a cost intelligence dashboard. Implemented CVM regulatory monitoring ensuring early detection of data inconsistencies. Leading migration of legacy pipelines to Data Mesh (DME).</w:t>
       </w:r>
     </w:p>
     <w:p>
       <w:pPr>
-        <w:pStyle w:val="ListBullet"/>
-        <w:spacing w:after="20"/>
-        <w:ind w:left="360"/>
+        <w:spacing w:before="20" w:after="60"/>
       </w:pPr>
       <w:r>
-        <w:t>Ranked top 0.41% of GenAI users among 10,000+ MELI employees; led hands-on training on n8n, Cursor, and LLM tools (Claude, Gemini, MCP), increasing team coding productivity by ~50%</w:t>
-      </w:r>
-    </w:p>
-    <w:p>
-      <w:pPr>
-        <w:pStyle w:val="ListBullet"/>
-        <w:spacing w:after="20"/>
-        <w:ind w:left="360"/>
-      </w:pPr>
-      <w:r>
-        <w:t>Built an automated FIDC Daily Cash pipeline using n8n (Verdi Flows) and Google Cloud Dataflow, unifying balances from 4+ fund sources — saving ~1 hour of manual work daily and optimizing inputs for the ENIGMA ML forecasting model</w:t>
-      </w:r>
-    </w:p>
-    <w:p>
-      <w:pPr>
-        <w:pStyle w:val="ListBullet"/>
-        <w:spacing w:after="20"/>
-        <w:ind w:left="360"/>
-      </w:pPr>
-      <w:r>
-        <w:t>Reduced the monthly financial closing process by 4 hours by engineering an automated classification system for financial movements (Expenses, Cash Received) and delivering a real-time cost intelligence dashboard across fund administrators</w:t>
-      </w:r>
-    </w:p>
-    <w:p>
-      <w:pPr>
-        <w:pStyle w:val="ListBullet"/>
-        <w:spacing w:after="20"/>
-        <w:ind w:left="360"/>
-      </w:pPr>
-      <w:r>
-        <w:t>Mitigated regulatory and reputational risk for investors by implementing automated CVM portal monitoring routines, ensuring early detection of data inconsistencies before public release</w:t>
-      </w:r>
-    </w:p>
-    <w:p>
-      <w:pPr>
-        <w:pStyle w:val="ListBullet"/>
-        <w:spacing w:after="20"/>
-        <w:ind w:left="360"/>
-      </w:pPr>
-      <w:r>
-        <w:t>Leading migration of legacy pipelines to Data Mesh (DME), standardizing documentation and scalability for all Funding data assets</w:t>
-      </w:r>
-    </w:p>
-    <w:p>
-      <w:pPr>
-        <w:spacing w:after="20"/>
-      </w:pPr>
-      <w:r>
+        <w:rPr>
+          <w:b/>
+          <w:color w:val="555555"/>
+          <w:sz w:val="17"/>
+        </w:rPr>
         <w:t>Tech: Python, BigQuery, Dataflow, n8n, GCP, SQL, Claude AI, Gemini, MCP, Looker Studio</w:t>
       </w:r>
     </w:p>
     <w:p>
       <w:pPr>
+        <w:tabs>
+          <w:tab w:pos="8928" w:val="right"/>
+        </w:tabs>
         <w:spacing w:before="120" w:after="20"/>
       </w:pPr>
       <w:r>
         <w:rPr>
           <w:b/>
-          <w:sz w:val="21"/>
+          <w:sz w:val="20"/>
         </w:rPr>
-        <w:t>Warren Investimentos                                           Jan 2025 – Jul 2025</w:t>
+        <w:t>Warren Investimentos</w:t>
+      </w:r>
+      <w:r>
+        <w:tab/>
+      </w:r>
+      <w:r>
+        <w:rPr>
+          <w:b/>
+          <w:color w:val="444444"/>
+          <w:sz w:val="20"/>
+        </w:rPr>
+        <w:t>Jan 2025 – Jul 2025</w:t>
       </w:r>
     </w:p>
     <w:p>
       <w:pPr>
-        <w:spacing w:after="20"/>
+        <w:spacing w:before="0" w:after="40"/>
       </w:pPr>
       <w:r>
-        <w:t>Data Analyst</w:t>
+        <w:rPr>
+          <w:b/>
+          <w:i w:val="0"/>
+          <w:color w:val="333333"/>
+          <w:sz w:val="20"/>
+        </w:rPr>
+        <w:t>Data Analyst | São Paulo · On-site</w:t>
       </w:r>
     </w:p>
     <w:p>
       <w:pPr>
-        <w:spacing w:after="20"/>
+        <w:spacing w:before="20" w:after="40"/>
       </w:pPr>
       <w:r>
-        <w:t>São Paulo, Brazil · On-site</w:t>
+        <w:rPr>
+          <w:color w:val="222222"/>
+          <w:sz w:val="19"/>
+        </w:rPr>
+        <w:t>Delivered weekly and monthly financial dashboards to C-Level tracking BMF, Bovespa, Private Credit, and Government Bonds trading desks. Built data pipelines in Databricks (PySpark + SQL) and automated processes with Python, reducing processing time. Collaborated directly with economists and strategists, providing data-driven insights for strategic decision-making.</w:t>
       </w:r>
     </w:p>
     <w:p>
       <w:pPr>
-        <w:pStyle w:val="ListBullet"/>
-        <w:spacing w:after="20"/>
-        <w:ind w:left="360"/>
+        <w:spacing w:before="20" w:after="60"/>
       </w:pPr>
       <w:r>
-        <w:t>Delivered weekly and monthly financial dashboards to C-Level tracking performance of BMF, Bovespa, Private Credit, and Government Bonds trading desks</w:t>
-      </w:r>
-    </w:p>
-    <w:p>
-      <w:pPr>
-        <w:pStyle w:val="ListBullet"/>
-        <w:spacing w:after="20"/>
-        <w:ind w:left="360"/>
-      </w:pPr>
-      <w:r>
-        <w:t>Built optimized data pipelines in Databricks using PySpark and SQL, reducing data processing time in direct collaboration with economists and strategists</w:t>
-      </w:r>
-    </w:p>
-    <w:p>
-      <w:pPr>
-        <w:pStyle w:val="ListBullet"/>
-        <w:spacing w:after="20"/>
-        <w:ind w:left="360"/>
-      </w:pPr>
-      <w:r>
-        <w:t>Automated repetitive reporting processes with Python, freeing analyst time for higher-value analysis</w:t>
-      </w:r>
-    </w:p>
-    <w:p>
-      <w:pPr>
-        <w:spacing w:after="20"/>
-      </w:pPr>
-      <w:r>
+        <w:rPr>
+          <w:b/>
+          <w:color w:val="555555"/>
+          <w:sz w:val="17"/>
+        </w:rPr>
         <w:t>Tech: Databricks, PySpark, SQL, Python, Power BI</w:t>
       </w:r>
     </w:p>
     <w:p>
       <w:pPr>
+        <w:tabs>
+          <w:tab w:pos="8928" w:val="right"/>
+        </w:tabs>
         <w:spacing w:before="120" w:after="20"/>
       </w:pPr>
       <w:r>
         <w:rPr>
           <w:b/>
-          <w:sz w:val="21"/>
+          <w:sz w:val="20"/>
         </w:rPr>
-        <w:t>Intel Corporation · Contract                                   Sep 2023 – Oct 2024</w:t>
+        <w:t>Intel Corporation · Contract</w:t>
+      </w:r>
+      <w:r>
+        <w:tab/>
+      </w:r>
+      <w:r>
+        <w:rPr>
+          <w:b/>
+          <w:color w:val="444444"/>
+          <w:sz w:val="20"/>
+        </w:rPr>
+        <w:t>Sep 2023 – Oct 2024</w:t>
       </w:r>
     </w:p>
     <w:p>
       <w:pPr>
-        <w:spacing w:after="20"/>
+        <w:spacing w:before="0" w:after="40"/>
       </w:pPr>
       <w:r>
-        <w:t>Data Engineer / BI Developer</w:t>
+        <w:rPr>
+          <w:b/>
+          <w:i w:val="0"/>
+          <w:color w:val="333333"/>
+          <w:sz w:val="20"/>
+        </w:rPr>
+        <w:t>Data Engineer / BI Developer | São Paulo · Remote (Global Team — English)</w:t>
       </w:r>
     </w:p>
     <w:p>
       <w:pPr>
-        <w:spacing w:after="20"/>
+        <w:spacing w:before="20" w:after="40"/>
       </w:pPr>
       <w:r>
-        <w:t>São Paulo, Brazil · Remote (Global Team — English)</w:t>
+        <w:rPr>
+          <w:color w:val="222222"/>
+          <w:sz w:val="19"/>
+        </w:rPr>
+        <w:t>Built and maintained CRM data pipelines from Salesforce using Databricks, Snowflake, and SSAS for a global English-speaking team. In the KPI optimization project, calculation time for a Salesforce opportunity was reduced by 90% using Azure Data Factory and Databricks notebooks. Developed Power BI and Tableau Salesforce dashboards applying DAX and data storytelling techniques.</w:t>
       </w:r>
     </w:p>
     <w:p>
       <w:pPr>
-        <w:pStyle w:val="ListBullet"/>
-        <w:spacing w:after="20"/>
-        <w:ind w:left="360"/>
+        <w:spacing w:before="20" w:after="60"/>
       </w:pPr>
       <w:r>
-        <w:t>Built and maintained CRM data pipelines from Salesforce using Databricks, Snowflake, and SSAS, creating SQL views and optimizing CRM KPIs for a global English-speaking team</w:t>
-      </w:r>
-    </w:p>
-    <w:p>
-      <w:pPr>
-        <w:pStyle w:val="ListBullet"/>
-        <w:spacing w:after="20"/>
-        <w:ind w:left="360"/>
-      </w:pPr>
-      <w:r>
-        <w:t>Developed Power BI and Tableau Salesforce dashboards applying DAX, data storytelling, and UX/UI principles, improving stakeholder decision-making</w:t>
-      </w:r>
-    </w:p>
-    <w:p>
-      <w:pPr>
-        <w:pStyle w:val="ListBullet"/>
-        <w:spacing w:after="20"/>
-        <w:ind w:left="360"/>
-      </w:pPr>
-      <w:r>
-        <w:t>Automated pipeline reports using Python, Azure DevOps, and Azure Data Factory, reducing manual intervention in the reporting cycle</w:t>
-      </w:r>
-    </w:p>
-    <w:p>
-      <w:pPr>
-        <w:spacing w:after="20"/>
-      </w:pPr>
-      <w:r>
+        <w:rPr>
+          <w:b/>
+          <w:color w:val="555555"/>
+          <w:sz w:val="17"/>
+        </w:rPr>
         <w:t>Tech: Databricks, Snowflake, SSAS, Power BI, Tableau, SQL, Python, Azure DevOps, ADF</w:t>
       </w:r>
     </w:p>
     <w:p>
       <w:pPr>
+        <w:tabs>
+          <w:tab w:pos="8928" w:val="right"/>
+        </w:tabs>
         <w:spacing w:before="120" w:after="20"/>
       </w:pPr>
       <w:r>
         <w:rPr>
           <w:b/>
-          <w:sz w:val="21"/>
+          <w:sz w:val="20"/>
         </w:rPr>
-        <w:t>BTG Pactual                                                    Aug 2022 – Jul 2023</w:t>
+        <w:t>BTG Pactual</w:t>
+      </w:r>
+      <w:r>
+        <w:tab/>
+      </w:r>
+      <w:r>
+        <w:rPr>
+          <w:b/>
+          <w:color w:val="444444"/>
+          <w:sz w:val="20"/>
+        </w:rPr>
+        <w:t>Aug 2022 – Jul 2023</w:t>
       </w:r>
     </w:p>
     <w:p>
       <w:pPr>
-        <w:spacing w:after="20"/>
+        <w:spacing w:before="0" w:after="40"/>
       </w:pPr>
       <w:r>
-        <w:t>Business Intelligence Developer</w:t>
+        <w:rPr>
+          <w:b/>
+          <w:i w:val="0"/>
+          <w:color w:val="333333"/>
+          <w:sz w:val="20"/>
+        </w:rPr>
+        <w:t>Business Intelligence Developer | São Paulo — Largest investment bank in Latin America</w:t>
       </w:r>
     </w:p>
     <w:p>
       <w:pPr>
-        <w:spacing w:after="20"/>
+        <w:spacing w:before="20" w:after="40"/>
       </w:pPr>
       <w:r>
-        <w:t>São Paulo, Brazil</w:t>
+        <w:rPr>
+          <w:color w:val="222222"/>
+          <w:sz w:val="19"/>
+        </w:rPr>
+        <w:t>Developed Power BI dashboards with SQL SSAS, DAX, data storytelling, and UX/UI best practices. Created prototypes directly with end users and managed projects to delivery. Delivered a Corporate Lending Dashboard that contributed to a 20% increase in revenues.</w:t>
       </w:r>
     </w:p>
     <w:p>
       <w:pPr>
-        <w:pStyle w:val="ListBullet"/>
-        <w:spacing w:after="20"/>
-        <w:ind w:left="360"/>
+        <w:spacing w:before="20" w:after="60"/>
       </w:pPr>
       <w:r>
-        <w:t>Increased revenue by 20% for the Corporate Lending team by delivering an end-to-end Power BI dashboard with actionable insights for the lending pipeline — at Latin America's largest investment bank</w:t>
-      </w:r>
-    </w:p>
-    <w:p>
-      <w:pPr>
-        <w:pStyle w:val="ListBullet"/>
-        <w:spacing w:after="20"/>
-        <w:ind w:left="360"/>
-      </w:pPr>
-      <w:r>
-        <w:t>Built Power BI dashboards applying SQL SSAS, DAX, data storytelling, and UX/UI best practices; created prototypes directly with end users and managed projects to delivery</w:t>
-      </w:r>
-    </w:p>
-    <w:p>
-      <w:pPr>
-        <w:pStyle w:val="ListBullet"/>
-        <w:spacing w:after="20"/>
-        <w:ind w:left="360"/>
-      </w:pPr>
-      <w:r>
-        <w:t>Optimized SQL queries and ETL processes (SQL + M language), improving report performance and data reliability</w:t>
-      </w:r>
-    </w:p>
-    <w:p>
-      <w:pPr>
-        <w:spacing w:after="20"/>
-      </w:pPr>
-      <w:r>
+        <w:rPr>
+          <w:b/>
+          <w:color w:val="555555"/>
+          <w:sz w:val="17"/>
+        </w:rPr>
         <w:t>Tech: Power BI, SQL, SSAS, DAX, ETL, M Language</w:t>
       </w:r>
     </w:p>
     <w:p>
       <w:pPr>
-        <w:spacing w:before="40" w:after="40"/>
+        <w:spacing w:before="40" w:after="80"/>
+        <w:pBdr>
+          <w:bottom w:val="single" w:sz="6" w:space="1" w:color="222222"/>
+        </w:pBdr>
+      </w:pPr>
+    </w:p>
+    <w:p>
+      <w:pPr>
+        <w:spacing w:before="160" w:after="80"/>
       </w:pPr>
       <w:r>
         <w:rPr>
-          <w:color w:val="BBBBBB"/>
-          <w:sz w:val="16"/>
+          <w:b/>
+          <w:color w:val="111111"/>
+          <w:sz w:val="20"/>
         </w:rPr>
-        <w:t>────────────────────────────────────────────────────────────────────────────────</w:t>
+        <w:t>EDUCATION &amp; CERTIFICATIONS</w:t>
       </w:r>
     </w:p>
     <w:p>
       <w:pPr>
-        <w:spacing w:before="120" w:after="40"/>
+        <w:spacing w:before="40" w:after="80"/>
+        <w:pBdr>
+          <w:bottom w:val="single" w:sz="6" w:space="1" w:color="444444"/>
+        </w:pBdr>
       </w:pPr>
-      <w:r>
-        <w:rPr>
-          <w:b/>
-          <w:color w:val="1A56AA"/>
-          <w:sz w:val="22"/>
-        </w:rPr>
-        <w:t>EDUCATION</w:t>
-      </w:r>
     </w:p>
-    <w:p>
-      <w:pPr>
-        <w:spacing w:before="120" w:after="20"/>
-      </w:pPr>
-      <w:r>
-        <w:rPr>
-          <w:b/>
-          <w:sz w:val="21"/>
-        </w:rPr>
-        <w:t>Instituto Federal de São Paulo (IFSP)                          2022 – 2024</w:t>
-      </w:r>
-    </w:p>
-    <w:p>
-      <w:pPr>
-        <w:spacing w:after="20"/>
-      </w:pPr>
-      <w:r>
-        <w:t>Technologist in Systems Analysis and Development</w:t>
-      </w:r>
-    </w:p>
-    <w:p>
-      <w:pPr>
-        <w:spacing w:before="120" w:after="20"/>
-      </w:pPr>
-      <w:r>
-        <w:rPr>
-          <w:b/>
-          <w:sz w:val="21"/>
-        </w:rPr>
-        <w:t>Universidade de São Paulo (USP)                                2018 – 2021</w:t>
-      </w:r>
-    </w:p>
-    <w:p>
-      <w:pPr>
-        <w:spacing w:after="20"/>
-      </w:pPr>
-      <w:r>
-        <w:t>Bachelor's Degree in Physical Education and Health</w:t>
-      </w:r>
-    </w:p>
-    <w:p>
-      <w:pPr>
-        <w:spacing w:before="40" w:after="40"/>
-      </w:pPr>
-      <w:r>
-        <w:rPr>
-          <w:color w:val="BBBBBB"/>
-          <w:sz w:val="16"/>
-        </w:rPr>
-        <w:t>────────────────────────────────────────────────────────────────────────────────</w:t>
-      </w:r>
-    </w:p>
-    <w:p>
-      <w:pPr>
-        <w:spacing w:before="120" w:after="40"/>
-      </w:pPr>
-      <w:r>
-        <w:rPr>
-          <w:b/>
-          <w:color w:val="1A56AA"/>
-          <w:sz w:val="22"/>
-        </w:rPr>
-        <w:t>TECHNICAL SKILLS</w:t>
-      </w:r>
-    </w:p>
-    <w:p>
-      <w:pPr>
-        <w:spacing w:after="20"/>
-      </w:pPr>
-      <w:r>
-        <w:t>Languages:          Python, SQL, Bash</w:t>
-      </w:r>
-    </w:p>
-    <w:p>
-      <w:pPr>
-        <w:spacing w:after="20"/>
-      </w:pPr>
-      <w:r>
-        <w:t>Cloud &amp; Data:       GCP, BigQuery, Google Cloud Dataflow, Cloud Storage, AWS</w:t>
-      </w:r>
-    </w:p>
-    <w:p>
-      <w:pPr>
-        <w:spacing w:after="20"/>
-      </w:pPr>
-      <w:r>
-        <w:t>AI &amp; ML:            LLMs, AI Agents, RAG, Claude AI, Gemini, DeepSeek, Agno, CrewAI,</w:t>
-      </w:r>
-    </w:p>
-    <w:p>
-      <w:pPr>
-        <w:spacing w:after="20"/>
-      </w:pPr>
-      <w:r>
-        <w:t>MCP (Model Context Protocol), LangChain, AI-assisted coding</w:t>
-      </w:r>
-    </w:p>
-    <w:p>
-      <w:pPr>
-        <w:spacing w:after="20"/>
-      </w:pPr>
-      <w:r>
-        <w:t>Libraries:          Pandas, NumPy, Plotly, Dash, FastAPI, Flask, Streamlit, Pydantic, openpyxl</w:t>
-      </w:r>
-    </w:p>
-    <w:p>
-      <w:pPr>
-        <w:spacing w:after="20"/>
-      </w:pPr>
-      <w:r>
-        <w:t>Automation:         n8n (Verdi Flows), Dataflow pipelines, ETL automation</w:t>
-      </w:r>
-    </w:p>
-    <w:p>
-      <w:pPr>
-        <w:spacing w:after="20"/>
-      </w:pPr>
-      <w:r>
-        <w:t>BI &amp; Analytics:     Power BI, Looker Studio, Tableau, Databricks, Snowflake, SSAS, DAX</w:t>
-      </w:r>
-    </w:p>
-    <w:p>
-      <w:pPr>
-        <w:spacing w:after="20"/>
-      </w:pPr>
-      <w:r>
-        <w:t>Databases:          PostgreSQL, Supabase, BigQuery, SQLite</w:t>
-      </w:r>
-    </w:p>
-    <w:p>
-      <w:pPr>
-        <w:spacing w:after="20"/>
-      </w:pPr>
-      <w:r>
-        <w:t>Tools:              Git, Docker, Vercel, Azure DevOps, Azure Data Factory</w:t>
-      </w:r>
-    </w:p>
-    <w:p>
-      <w:pPr>
-        <w:spacing w:before="40" w:after="40"/>
-      </w:pPr>
-      <w:r>
-        <w:rPr>
-          <w:color w:val="BBBBBB"/>
-          <w:sz w:val="16"/>
-        </w:rPr>
-        <w:t>────────────────────────────────────────────────────────────────────────────────</w:t>
-      </w:r>
-    </w:p>
-    <w:p>
-      <w:pPr>
-        <w:spacing w:before="120" w:after="40"/>
-      </w:pPr>
-      <w:r>
-        <w:rPr>
-          <w:b/>
-          <w:color w:val="1A56AA"/>
-          <w:sz w:val="22"/>
-        </w:rPr>
-        <w:t>CERTIFICATIONS</w:t>
-      </w:r>
-    </w:p>
-    <w:p>
-      <w:pPr>
-        <w:pStyle w:val="ListBullet"/>
-        <w:spacing w:after="20"/>
-        <w:ind w:left="360"/>
-      </w:pPr>
-      <w:r>
-        <w:t>Databricks Academy Accreditation — Lakehouse Fundamentals</w:t>
-      </w:r>
-    </w:p>
-    <w:p>
-      <w:pPr>
-        <w:pStyle w:val="ListBullet"/>
-        <w:spacing w:after="20"/>
-        <w:ind w:left="360"/>
-      </w:pPr>
-      <w:r>
-        <w:t>Snowflake Hands-On Essentials: Data Warehousing Workshop</w:t>
-      </w:r>
-    </w:p>
-    <w:p>
-      <w:pPr>
-        <w:pStyle w:val="ListBullet"/>
-        <w:spacing w:after="20"/>
-        <w:ind w:left="360"/>
-      </w:pPr>
-      <w:r>
-        <w:t>Microsoft Azure Data Factory — Introduction to Azure Data Factory</w:t>
-      </w:r>
-    </w:p>
-    <w:p>
-      <w:pPr>
-        <w:pStyle w:val="ListBullet"/>
-        <w:spacing w:after="20"/>
-        <w:ind w:left="360"/>
-      </w:pPr>
-      <w:r>
-        <w:t>AWS Cloud Camp — Big Data on AWS</w:t>
-      </w:r>
-    </w:p>
-    <w:p>
-      <w:pPr>
-        <w:pStyle w:val="ListBullet"/>
-        <w:spacing w:after="20"/>
-        <w:ind w:left="360"/>
-      </w:pPr>
-      <w:r>
-        <w:t>English C2 — Proficient (EF Standard English Test)</w:t>
-      </w:r>
-    </w:p>
-    <w:p>
-      <w:pPr>
-        <w:spacing w:before="40" w:after="40"/>
-      </w:pPr>
-      <w:r>
-        <w:rPr>
-          <w:color w:val="BBBBBB"/>
-          <w:sz w:val="16"/>
-        </w:rPr>
-        <w:t>────────────────────────────────────────────────────────────────────────────────</w:t>
-      </w:r>
-    </w:p>
-    <w:p>
-      <w:pPr>
-        <w:spacing w:before="120" w:after="40"/>
-      </w:pPr>
-      <w:r>
-        <w:rPr>
-          <w:b/>
-          <w:color w:val="1A56AA"/>
-          <w:sz w:val="22"/>
-        </w:rPr>
-        <w:t>LANGUAGES</w:t>
-      </w:r>
-    </w:p>
-    <w:p>
-      <w:pPr>
-        <w:spacing w:after="20"/>
-      </w:pPr>
-      <w:r>
-        <w:t>Portuguese    Native</w:t>
-      </w:r>
-    </w:p>
-    <w:p>
-      <w:pPr>
-        <w:spacing w:after="20"/>
-      </w:pPr>
-      <w:r>
-        <w:t>English       Professional Working Proficiency (C2)</w:t>
-      </w:r>
-    </w:p>
-    <w:p>
-      <w:pPr>
-        <w:spacing w:after="20"/>
-      </w:pPr>
-      <w:r>
-        <w:t>Spanish       Professional Working Proficiency</w:t>
-      </w:r>
-    </w:p>
-    <w:p>
-      <w:pPr>
-        <w:spacing w:after="20"/>
-      </w:pPr>
-      <w:r>
-        <w:t>Italian       Elementary</w:t>
-      </w:r>
-    </w:p>
-    <w:p>
-      <w:pPr>
-        <w:spacing w:before="40" w:after="40"/>
-      </w:pPr>
-      <w:r>
-        <w:rPr>
-          <w:color w:val="BBBBBB"/>
-          <w:sz w:val="16"/>
-        </w:rPr>
-        <w:t>────────────────────────────────────────────────────────────────────────────────</w:t>
-      </w:r>
-    </w:p>
+    <w:tbl>
+      <w:tblPr>
+        <w:tblStyle w:val="TableGrid"/>
+        <w:tblW w:type="auto" w:w="0"/>
+        <w:tblLook w:firstColumn="1" w:firstRow="1" w:lastColumn="0" w:lastRow="0" w:noHBand="0" w:noVBand="1" w:val="04A0"/>
+      </w:tblPr>
+      <w:tblGrid>
+        <w:gridCol w:w="5040"/>
+        <w:gridCol w:w="4320"/>
+      </w:tblGrid>
+      <w:tr>
+        <w:tc>
+          <w:tcPr>
+            <w:tcW w:type="dxa" w:w="4968"/>
+            <w:tcBorders>
+              <w:left w:val="none"/>
+              <w:top w:val="none"/>
+              <w:right w:val="none"/>
+              <w:bottom w:val="none"/>
+              <w:insideH w:val="none"/>
+              <w:insideV w:val="none"/>
+            </w:tcBorders>
+          </w:tcPr>
+          <w:p/>
+          <w:p>
+            <w:pPr>
+              <w:spacing w:after="20"/>
+            </w:pPr>
+            <w:r>
+              <w:rPr>
+                <w:b/>
+                <w:sz w:val="19"/>
+              </w:rPr>
+              <w:t>Instituto Federal de São Paulo (IFSP)</w:t>
+            </w:r>
+          </w:p>
+          <w:p>
+            <w:pPr>
+              <w:spacing w:after="100"/>
+            </w:pPr>
+            <w:r>
+              <w:rPr>
+                <w:color w:val="444444"/>
+                <w:sz w:val="18"/>
+              </w:rPr>
+              <w:t>Technologist in Systems Analysis and Development · 2022–2024</w:t>
+            </w:r>
+          </w:p>
+          <w:p>
+            <w:pPr>
+              <w:spacing w:after="20"/>
+            </w:pPr>
+            <w:r>
+              <w:rPr>
+                <w:b/>
+                <w:sz w:val="19"/>
+              </w:rPr>
+              <w:t>Universidade de São Paulo (USP)</w:t>
+            </w:r>
+          </w:p>
+          <w:p>
+            <w:pPr>
+              <w:spacing w:after="100"/>
+            </w:pPr>
+            <w:r>
+              <w:rPr>
+                <w:color w:val="444444"/>
+                <w:sz w:val="18"/>
+              </w:rPr>
+              <w:t>Bachelor's in Physical Education and Health · 2018–2021</w:t>
+            </w:r>
+          </w:p>
+          <w:p>
+            <w:pPr>
+              <w:spacing w:after="20"/>
+            </w:pPr>
+            <w:r>
+              <w:rPr>
+                <w:b/>
+                <w:sz w:val="19"/>
+              </w:rPr>
+              <w:t>Certifications</w:t>
+            </w:r>
+          </w:p>
+          <w:p>
+            <w:pPr>
+              <w:spacing w:after="100"/>
+            </w:pPr>
+            <w:r>
+              <w:rPr>
+                <w:color w:val="444444"/>
+                <w:sz w:val="18"/>
+              </w:rPr>
+              <w:t>Databricks Lakehouse · Snowflake Data Warehousing</w:t>
+              <w:br/>
+              <w:t>Azure Data Factory · AWS Big Data · English C2</w:t>
+            </w:r>
+          </w:p>
+        </w:tc>
+        <w:tc>
+          <w:tcPr>
+            <w:tcW w:type="dxa" w:w="4968"/>
+            <w:tcBorders>
+              <w:left w:val="none"/>
+              <w:top w:val="none"/>
+              <w:right w:val="none"/>
+              <w:bottom w:val="none"/>
+              <w:insideH w:val="none"/>
+              <w:insideV w:val="none"/>
+            </w:tcBorders>
+          </w:tcPr>
+          <w:p/>
+          <w:p>
+            <w:pPr>
+              <w:spacing w:after="0"/>
+            </w:pPr>
+            <w:r>
+              <w:rPr>
+                <w:b/>
+                <w:sz w:val="20"/>
+              </w:rPr>
+              <w:t>Languages</w:t>
+            </w:r>
+          </w:p>
+          <w:p>
+            <w:pPr>
+              <w:spacing w:after="20"/>
+            </w:pPr>
+            <w:r>
+              <w:rPr>
+                <w:b/>
+                <w:sz w:val="19"/>
+              </w:rPr>
+              <w:t xml:space="preserve">English  </w:t>
+            </w:r>
+            <w:r>
+              <w:rPr>
+                <w:color w:val="555555"/>
+                <w:sz w:val="18"/>
+              </w:rPr>
+              <w:t>Professional Working Proficiency (C2)</w:t>
+            </w:r>
+          </w:p>
+          <w:p>
+            <w:pPr>
+              <w:spacing w:after="20"/>
+            </w:pPr>
+            <w:r>
+              <w:rPr>
+                <w:b/>
+                <w:sz w:val="19"/>
+              </w:rPr>
+              <w:t xml:space="preserve">Portuguese  </w:t>
+            </w:r>
+            <w:r>
+              <w:rPr>
+                <w:color w:val="555555"/>
+                <w:sz w:val="18"/>
+              </w:rPr>
+              <w:t>Native</w:t>
+            </w:r>
+          </w:p>
+          <w:p>
+            <w:pPr>
+              <w:spacing w:after="20"/>
+            </w:pPr>
+            <w:r>
+              <w:rPr>
+                <w:b/>
+                <w:sz w:val="19"/>
+              </w:rPr>
+              <w:t xml:space="preserve">Spanish  </w:t>
+            </w:r>
+            <w:r>
+              <w:rPr>
+                <w:color w:val="555555"/>
+                <w:sz w:val="18"/>
+              </w:rPr>
+              <w:t>Professional Working</w:t>
+            </w:r>
+          </w:p>
+          <w:p>
+            <w:pPr>
+              <w:spacing w:after="20"/>
+            </w:pPr>
+            <w:r>
+              <w:rPr>
+                <w:b/>
+                <w:sz w:val="19"/>
+              </w:rPr>
+              <w:t xml:space="preserve">Italian  </w:t>
+            </w:r>
+            <w:r>
+              <w:rPr>
+                <w:color w:val="555555"/>
+                <w:sz w:val="18"/>
+              </w:rPr>
+              <w:t>Elementary</w:t>
+            </w:r>
+          </w:p>
+        </w:tc>
+      </w:tr>
+    </w:tbl>
     <w:sectPr>
       <w:pgSz w:w="12240" w:h="15840"/>
-      <w:pgMar w:top="1008" w:right="1296" w:bottom="1008" w:left="1296" w:header="720" w:footer="720" w:gutter="0"/>
+      <w:pgMar w:top="864" w:right="1152" w:bottom="864" w:left="1152" w:header="720" w:footer="720" w:gutter="0"/>
       <w:cols w:space="720"/>
       <w:docGrid w:linePitch="360"/>
     </w:sectPr>

</xml_diff>

<commit_message>
chore: update CVs optimized for Amazon/Uber/Revolut ATS keywords
</commit_message>
<xml_diff>
--- a/assets/cv/Felipe_Romani_CV_EN.docx
+++ b/assets/cv/Felipe_Romani_CV_EN.docx
@@ -180,7 +180,7 @@
         <w:rPr>
           <w:sz w:val="19"/>
         </w:rPr>
-        <w:t>Data Analyst and AI Developer with 4+ years of experience delivering data products across investment banking, semiconductors, brokerage, and fintech. Ranked top 0.41% of GenAI users among 10,000+ MercadoLibre employees. Expertise in Python, SQL, BigQuery, GCP, n8n, and LLMs, with a proven track record of building production data pipelines, automating complex financial processes, and leading AI adoption that increased team coding productivity by ~50%. Fluent in English (C2) with experience on global teams.</w:t>
+        <w:t>Data Analyst and AI Developer with 4+ years of experience building ETL/ELT pipelines, self-service reporting platforms, and data models across fintech, investment banking, and semiconductors. Specialized in financial and regulatory data (CVM, FIDCs, treasury operations), Advanced SQL, Python automation, and cloud data warehousing (BigQuery, Snowflake). Ranked top 0.41% of GenAI users at MercadoLibre (10,000+ employees), leading AI adoption with LLMs and workflow orchestration tools (n8n). Proven track record of reducing manual processes by hours, delivering C-Level dashboards, and ensuring regulatory data quality. Fluent in English (C2).</w:t>
       </w:r>
     </w:p>
     <w:p>
@@ -245,7 +245,7 @@
               <w:rPr>
                 <w:sz w:val="19"/>
               </w:rPr>
-              <w:t>Python</w:t>
+              <w:t>Python · Automation &amp; Scripting</w:t>
             </w:r>
           </w:p>
           <w:p>
@@ -256,7 +256,7 @@
               <w:rPr>
                 <w:sz w:val="19"/>
               </w:rPr>
-              <w:t>SQL / BigQuery</w:t>
+              <w:t>Advanced SQL · NoSQL</w:t>
             </w:r>
           </w:p>
           <w:p>
@@ -267,7 +267,7 @@
               <w:rPr>
                 <w:sz w:val="19"/>
               </w:rPr>
-              <w:t>Power BI / Looker Studio</w:t>
+              <w:t>ETL / ELT Pipelines</w:t>
             </w:r>
           </w:p>
           <w:p>
@@ -278,7 +278,7 @@
               <w:rPr>
                 <w:sz w:val="19"/>
               </w:rPr>
-              <w:t>Git / Docker / Vercel</w:t>
+              <w:t>Data Modeling / Star Schema</w:t>
             </w:r>
           </w:p>
         </w:tc>
@@ -303,6 +303,17 @@
               <w:rPr>
                 <w:sz w:val="19"/>
               </w:rPr>
+              <w:t>BigQuery · Snowflake · Redshift</w:t>
+            </w:r>
+          </w:p>
+          <w:p>
+            <w:pPr>
+              <w:spacing w:after="20"/>
+            </w:pPr>
+            <w:r>
+              <w:rPr>
+                <w:sz w:val="19"/>
+              </w:rPr>
               <w:t>GCP / Dataflow / Cloud Storage</w:t>
             </w:r>
           </w:p>
@@ -314,7 +325,7 @@
               <w:rPr>
                 <w:sz w:val="19"/>
               </w:rPr>
-              <w:t>n8n (Verdi Flows)</w:t>
+              <w:t>Power BI · Looker · Tableau</w:t>
             </w:r>
           </w:p>
           <w:p>
@@ -325,18 +336,7 @@
               <w:rPr>
                 <w:sz w:val="19"/>
               </w:rPr>
-              <w:t>Databricks / Snowflake</w:t>
-            </w:r>
-          </w:p>
-          <w:p>
-            <w:pPr>
-              <w:spacing w:after="20"/>
-            </w:pPr>
-            <w:r>
-              <w:rPr>
-                <w:sz w:val="19"/>
-              </w:rPr>
-              <w:t>FastAPI / Flask / Streamlit</w:t>
+              <w:t>n8n · Orchestration &amp; Workflow</w:t>
             </w:r>
           </w:p>
         </w:tc>
@@ -361,7 +361,7 @@
               <w:rPr>
                 <w:sz w:val="19"/>
               </w:rPr>
-              <w:t>Claude AI / Gemini / LLMs</w:t>
+              <w:t>Claude AI · Gemini · LLMs</w:t>
             </w:r>
           </w:p>
           <w:p>
@@ -372,7 +372,7 @@
               <w:rPr>
                 <w:sz w:val="19"/>
               </w:rPr>
-              <w:t>AI Agents / RAG / MCP</w:t>
+              <w:t>AI Agents · RAG · MCP</w:t>
             </w:r>
           </w:p>
           <w:p>
@@ -383,7 +383,7 @@
               <w:rPr>
                 <w:sz w:val="19"/>
               </w:rPr>
-              <w:t>Pandas / NumPy / Plotly</w:t>
+              <w:t>Pandas · NumPy · PySpark</w:t>
             </w:r>
           </w:p>
           <w:p>
@@ -394,7 +394,7 @@
               <w:rPr>
                 <w:sz w:val="19"/>
               </w:rPr>
-              <w:t>Azure DevOps / ADF</w:t>
+              <w:t>Streamlit · Flask · FastAPI</w:t>
             </w:r>
           </w:p>
         </w:tc>
@@ -478,7 +478,7 @@
           <w:color w:val="222222"/>
           <w:sz w:val="19"/>
         </w:rPr>
-        <w:t>Ranked top 0.41% of GenAI users among 10,000+ MELI employees. Led training on n8n, Cursor, and LLMs (Claude, Gemini, MCP), increasing team coding productivity by ~50%. Built FIDC Daily Cash Automation using n8n (Verdi Flows) and Dataflow, unifying 4+ fund sources — saving ~1 hour of manual work daily and optimizing inputs for the ENIGMA ML model. Reduced monthly closing by 4 hours by engineering an automated classification system for financial movements and delivering a cost intelligence dashboard. Implemented CVM regulatory monitoring ensuring early detection of data inconsistencies. Leading migration of legacy pipelines to Data Mesh (DME).</w:t>
+        <w:t>Ranked top 0.41% of GenAI users among 10,000+ MELI employees — led LLM tool adoption (Claude, Gemini, MCP, n8n), increasing team coding productivity by ~50%. Designed and deployed ETL pipelines and orchestrated workflows using n8n (Verdi Flows) and Dataflow, unifying financial data from 4+ sources and saving ~1 hour of manual work daily. Built automated data quality controls and classification system for financial movements, reducing monthly closing by 4 hours. Implemented regulatory data monitoring for the CVM portal, ensuring early detection of reconciliation inconsistencies — directly improving data accuracy for investors. Led data governance migration to Data Mesh (DME), standardizing documentation and scalability across all Funding data assets.</w:t>
       </w:r>
     </w:p>
     <w:p>
@@ -491,7 +491,7 @@
           <w:color w:val="555555"/>
           <w:sz w:val="17"/>
         </w:rPr>
-        <w:t>Tech: Python, BigQuery, Dataflow, n8n, GCP, SQL, Claude AI, Gemini, MCP, Looker Studio</w:t>
+        <w:t>Tech: Python, Advanced SQL, BigQuery, Dataflow, n8n, GCP, LLMs, Looker Studio, Data Modeling</w:t>
       </w:r>
     </w:p>
     <w:p>
@@ -543,7 +543,7 @@
           <w:color w:val="222222"/>
           <w:sz w:val="19"/>
         </w:rPr>
-        <w:t>Delivered weekly and monthly financial dashboards to C-Level tracking BMF, Bovespa, Private Credit, and Government Bonds trading desks. Built data pipelines in Databricks (PySpark + SQL) and automated processes with Python, reducing processing time. Collaborated directly with economists and strategists, providing data-driven insights for strategic decision-making.</w:t>
+        <w:t>Built self-service reporting infrastructure and financial dashboards for C-Level tracking BMF, Bovespa, Private Credit, and Government Bonds trading desks. Designed and optimized ELT pipelines in Databricks (PySpark + SQL), reducing data processing time through query optimization and automation. Collaborated with economists and strategists on ad-hoc analysis and performance metrics, applying window functions and complex aggregations for accurate financial KPIs.</w:t>
       </w:r>
     </w:p>
     <w:p>
@@ -556,7 +556,7 @@
           <w:color w:val="555555"/>
           <w:sz w:val="17"/>
         </w:rPr>
-        <w:t>Tech: Databricks, PySpark, SQL, Python, Power BI</w:t>
+        <w:t>Tech: Databricks, PySpark, Advanced SQL, Python, Power BI, Query Optimization</w:t>
       </w:r>
     </w:p>
     <w:p>
@@ -608,7 +608,7 @@
           <w:color w:val="222222"/>
           <w:sz w:val="19"/>
         </w:rPr>
-        <w:t>Built and maintained CRM data pipelines from Salesforce using Databricks, Snowflake, and SSAS for a global English-speaking team. In the KPI optimization project, calculation time for a Salesforce opportunity was reduced by 90% using Azure Data Factory and Databricks notebooks. Developed Power BI and Tableau Salesforce dashboards applying DAX and data storytelling techniques.</w:t>
+        <w:t>Designed and maintained CRM data pipelines from Salesforce using Databricks, Snowflake (cloud DWH), and SSAS, implementing data models and SQL views for a global English-speaking team. Reduced KPI calculation time in Salesforce by 90% using Azure Data Factory and Databricks with PySpark. Built self-service dashboards in Power BI and Tableau applying DAX, data storytelling, and data modeling best practices to support sales decision-making.</w:t>
       </w:r>
     </w:p>
     <w:p>
@@ -673,7 +673,7 @@
           <w:color w:val="222222"/>
           <w:sz w:val="19"/>
         </w:rPr>
-        <w:t>Developed Power BI dashboards with SQL SSAS, DAX, data storytelling, and UX/UI best practices. Created prototypes directly with end users and managed projects to delivery. Delivered a Corporate Lending Dashboard that contributed to a 20% increase in revenues.</w:t>
+        <w:t>Delivered a Corporate Lending Dashboard with ETL pipelines (SQL + M language), data modeling, and business KPIs — contributing to a 20% increase in revenues. Built self-service Power BI reports applying SQL SSAS, DAX, and UX/UI best practices. Engaged directly with end users to gather requirements, created prototypes, and managed projects end-to-end.</w:t>
       </w:r>
     </w:p>
     <w:p>
@@ -686,7 +686,7 @@
           <w:color w:val="555555"/>
           <w:sz w:val="17"/>
         </w:rPr>
-        <w:t>Tech: Power BI, SQL, SSAS, DAX, ETL, M Language</w:t>
+        <w:t>Tech: Power BI, SQL, SSAS, DAX, ETL, M Language, Data Modeling</w:t>
       </w:r>
     </w:p>
     <w:p>

</xml_diff>